<commit_message>
Adiciona página de contato com busca de CEP (ViaCEP) e atualiza escopo
- contato.html: formulário acessível com validação HTML5, dados fictícios e equipe
- js/cep.js: máscara do CEP, consulta ao ViaCEP e mensagens com aria-live
- css/style.css: estilos do formulário e da página de contato
- docs: remove Breno Santos Costa e divide a etapa 5 entre Kaue e Felipe

Co-Authored-By: Claude Opus 5.5 <noreply@anthropic.com>
</commit_message>
<xml_diff>
--- a/docs/escopo-projeto.docx
+++ b/docs/escopo-projeto.docx
@@ -313,7 +313,6 @@
 Gustavo Mariano Carvalho - RGM 47720689
 Felipe Fragoso - RGM 1747539101
 Jihady Nikuluz Cardoso - RGM 47560789
-Breno Santos Costa - RGM 47770473
 Kaue Cândido Alberti - RGM 47556668</w:t>
             </w:r>
           </w:p>
@@ -3647,7 +3646,7 @@
                 <w:sz w:val="20"/>
                 <w:szCs w:val="20"/>
               </w:rPr>
-              <w:t xml:space="preserve">Breno Santos Costa</w:t>
+              <w:t xml:space="preserve">Kaue Cândido Alberti (noticias.html) e Felipe Fragoso (contato.html)</w:t>
             </w:r>
           </w:p>
         </w:tc>
@@ -3939,7 +3938,7 @@
           <w:sz w:val="18"/>
           <w:szCs w:val="18"/>
         </w:rPr>
-        <w:t xml:space="preserve">Divisão sugerida pela ordem da lista de integrantes - a equipe pode reorganizar conforme disponibilidade de cada um.</w:t>
+        <w:t xml:space="preserve">Divisão sugerida pela ordem da lista de integrantes. Com a saída de um integrante, a etapa 5 foi dividida entre Kaue Cândido Alberti e Felipe Fragoso - a equipe pode reorganizar conforme disponibilidade de cada um.</w:t>
       </w:r>
     </w:p>
     <w:p>

</xml_diff>